<commit_message>
ajustes en documento Word
</commit_message>
<xml_diff>
--- a/src/AE2/documento/EA2_Propuesta_HouseSales.docx
+++ b/src/AE2/documento/EA2_Propuesta_HouseSales.docx
@@ -23,15 +23,7 @@
         <w:jc w:val="center"/>
       </w:pPr>
       <w:r>
-        <w:t xml:space="preserve">Jonathan </w:t>
-      </w:r>
-      <w:proofErr w:type="spellStart"/>
-      <w:r>
-        <w:t>Alvarez</w:t>
-      </w:r>
-      <w:proofErr w:type="spellEnd"/>
-      <w:r>
-        <w:t xml:space="preserve"> Bustamante</w:t>
+        <w:t>Jonathan Alvarez Bustamante</w:t>
       </w:r>
     </w:p>
     <w:p>
@@ -51,8 +43,13 @@
       <w:pPr>
         <w:jc w:val="center"/>
       </w:pPr>
-      <w:r>
-        <w:t xml:space="preserve">Yonier Alexis Quiceno </w:t>
+      <w:proofErr w:type="spellStart"/>
+      <w:r>
+        <w:t>Yonier</w:t>
+      </w:r>
+      <w:proofErr w:type="spellEnd"/>
+      <w:r>
+        <w:t xml:space="preserve"> Alexis Quiceno </w:t>
       </w:r>
       <w:proofErr w:type="spellStart"/>
       <w:r>
@@ -135,6 +132,7 @@
           <w:docPartUnique/>
         </w:docPartObj>
       </w:sdtPr>
+      <w:sdtEndPr/>
       <w:sdtContent>
         <w:p>
           <w:pPr>
@@ -143,7 +141,10 @@
               <w:tab w:val="right" w:leader="dot" w:pos="9350"/>
             </w:tabs>
             <w:rPr>
+              <w:rFonts w:asciiTheme="minorHAnsi" w:eastAsiaTheme="minorEastAsia" w:hAnsiTheme="minorHAnsi" w:cstheme="minorBidi"/>
               <w:noProof/>
+              <w:kern w:val="2"/>
+              <w14:ligatures w14:val="standardContextual"/>
             </w:rPr>
           </w:pPr>
           <w:r>
@@ -155,7 +156,7 @@
           <w:r>
             <w:fldChar w:fldCharType="separate"/>
           </w:r>
-          <w:hyperlink w:anchor="_Toc243757970" w:history="1">
+          <w:hyperlink w:anchor="_Toc243766304" w:history="1">
             <w:r>
               <w:rPr>
                 <w:rStyle w:val="Hipervnculo"/>
@@ -182,7 +183,7 @@
                 <w:noProof/>
                 <w:webHidden/>
               </w:rPr>
-              <w:instrText xml:space="preserve"> PAGEREF _Toc243757970 \h </w:instrText>
+              <w:instrText xml:space="preserve"> PAGEREF _Toc243766304 \h </w:instrText>
             </w:r>
             <w:r>
               <w:rPr>
@@ -220,10 +221,13 @@
               <w:tab w:val="right" w:leader="dot" w:pos="9350"/>
             </w:tabs>
             <w:rPr>
+              <w:rFonts w:asciiTheme="minorHAnsi" w:eastAsiaTheme="minorEastAsia" w:hAnsiTheme="minorHAnsi" w:cstheme="minorBidi"/>
               <w:noProof/>
+              <w:kern w:val="2"/>
+              <w14:ligatures w14:val="standardContextual"/>
             </w:rPr>
           </w:pPr>
-          <w:hyperlink w:anchor="_Toc243757971" w:history="1">
+          <w:hyperlink w:anchor="_Toc243766305" w:history="1">
             <w:r>
               <w:rPr>
                 <w:rStyle w:val="Hipervnculo"/>
@@ -250,7 +254,7 @@
                 <w:noProof/>
                 <w:webHidden/>
               </w:rPr>
-              <w:instrText xml:space="preserve"> PAGEREF _Toc243757971 \h </w:instrText>
+              <w:instrText xml:space="preserve"> PAGEREF _Toc243766305 \h </w:instrText>
             </w:r>
             <w:r>
               <w:rPr>
@@ -288,10 +292,13 @@
               <w:tab w:val="right" w:leader="dot" w:pos="9350"/>
             </w:tabs>
             <w:rPr>
+              <w:rFonts w:asciiTheme="minorHAnsi" w:eastAsiaTheme="minorEastAsia" w:hAnsiTheme="minorHAnsi" w:cstheme="minorBidi"/>
               <w:noProof/>
+              <w:kern w:val="2"/>
+              <w14:ligatures w14:val="standardContextual"/>
             </w:rPr>
           </w:pPr>
-          <w:hyperlink w:anchor="_Toc243757972" w:history="1">
+          <w:hyperlink w:anchor="_Toc243766306" w:history="1">
             <w:r>
               <w:rPr>
                 <w:rStyle w:val="Hipervnculo"/>
@@ -318,7 +325,7 @@
                 <w:noProof/>
                 <w:webHidden/>
               </w:rPr>
-              <w:instrText xml:space="preserve"> PAGEREF _Toc243757972 \h </w:instrText>
+              <w:instrText xml:space="preserve"> PAGEREF _Toc243766306 \h </w:instrText>
             </w:r>
             <w:r>
               <w:rPr>
@@ -356,10 +363,13 @@
               <w:tab w:val="right" w:leader="dot" w:pos="9350"/>
             </w:tabs>
             <w:rPr>
+              <w:rFonts w:asciiTheme="minorHAnsi" w:eastAsiaTheme="minorEastAsia" w:hAnsiTheme="minorHAnsi" w:cstheme="minorBidi"/>
               <w:noProof/>
+              <w:kern w:val="2"/>
+              <w14:ligatures w14:val="standardContextual"/>
             </w:rPr>
           </w:pPr>
-          <w:hyperlink w:anchor="_Toc243757973" w:history="1">
+          <w:hyperlink w:anchor="_Toc243766307" w:history="1">
             <w:r>
               <w:rPr>
                 <w:rStyle w:val="Hipervnculo"/>
@@ -386,7 +396,7 @@
                 <w:noProof/>
                 <w:webHidden/>
               </w:rPr>
-              <w:instrText xml:space="preserve"> PAGEREF _Toc243757973 \h </w:instrText>
+              <w:instrText xml:space="preserve"> PAGEREF _Toc243766307 \h </w:instrText>
             </w:r>
             <w:r>
               <w:rPr>
@@ -406,7 +416,7 @@
                 <w:noProof/>
                 <w:webHidden/>
               </w:rPr>
-              <w:t>6</w:t>
+              <w:t>7</w:t>
             </w:r>
             <w:r>
               <w:rPr>
@@ -424,10 +434,13 @@
               <w:tab w:val="right" w:leader="dot" w:pos="9350"/>
             </w:tabs>
             <w:rPr>
+              <w:rFonts w:asciiTheme="minorHAnsi" w:eastAsiaTheme="minorEastAsia" w:hAnsiTheme="minorHAnsi" w:cstheme="minorBidi"/>
               <w:noProof/>
+              <w:kern w:val="2"/>
+              <w14:ligatures w14:val="standardContextual"/>
             </w:rPr>
           </w:pPr>
-          <w:hyperlink w:anchor="_Toc243757974" w:history="1">
+          <w:hyperlink w:anchor="_Toc243766308" w:history="1">
             <w:r>
               <w:rPr>
                 <w:rStyle w:val="Hipervnculo"/>
@@ -454,7 +467,7 @@
                 <w:noProof/>
                 <w:webHidden/>
               </w:rPr>
-              <w:instrText xml:space="preserve"> PAGEREF _Toc243757974 \h </w:instrText>
+              <w:instrText xml:space="preserve"> PAGEREF _Toc243766308 \h </w:instrText>
             </w:r>
             <w:r>
               <w:rPr>
@@ -474,7 +487,7 @@
                 <w:noProof/>
                 <w:webHidden/>
               </w:rPr>
-              <w:t>7</w:t>
+              <w:t>8</w:t>
             </w:r>
             <w:r>
               <w:rPr>
@@ -492,10 +505,13 @@
               <w:tab w:val="right" w:leader="dot" w:pos="9350"/>
             </w:tabs>
             <w:rPr>
+              <w:rFonts w:asciiTheme="minorHAnsi" w:eastAsiaTheme="minorEastAsia" w:hAnsiTheme="minorHAnsi" w:cstheme="minorBidi"/>
               <w:noProof/>
+              <w:kern w:val="2"/>
+              <w14:ligatures w14:val="standardContextual"/>
             </w:rPr>
           </w:pPr>
-          <w:hyperlink w:anchor="_Toc243757975" w:history="1">
+          <w:hyperlink w:anchor="_Toc243766309" w:history="1">
             <w:r>
               <w:rPr>
                 <w:rStyle w:val="Hipervnculo"/>
@@ -522,7 +538,7 @@
                 <w:noProof/>
                 <w:webHidden/>
               </w:rPr>
-              <w:instrText xml:space="preserve"> PAGEREF _Toc243757975 \h </w:instrText>
+              <w:instrText xml:space="preserve"> PAGEREF _Toc243766309 \h </w:instrText>
             </w:r>
             <w:r>
               <w:rPr>
@@ -542,7 +558,7 @@
                 <w:noProof/>
                 <w:webHidden/>
               </w:rPr>
-              <w:t>8</w:t>
+              <w:t>9</w:t>
             </w:r>
             <w:r>
               <w:rPr>
@@ -560,10 +576,13 @@
               <w:tab w:val="right" w:leader="dot" w:pos="9350"/>
             </w:tabs>
             <w:rPr>
+              <w:rFonts w:asciiTheme="minorHAnsi" w:eastAsiaTheme="minorEastAsia" w:hAnsiTheme="minorHAnsi" w:cstheme="minorBidi"/>
               <w:noProof/>
+              <w:kern w:val="2"/>
+              <w14:ligatures w14:val="standardContextual"/>
             </w:rPr>
           </w:pPr>
-          <w:hyperlink w:anchor="_Toc243757976" w:history="1">
+          <w:hyperlink w:anchor="_Toc243766310" w:history="1">
             <w:r>
               <w:rPr>
                 <w:rStyle w:val="Hipervnculo"/>
@@ -590,7 +609,7 @@
                 <w:noProof/>
                 <w:webHidden/>
               </w:rPr>
-              <w:instrText xml:space="preserve"> PAGEREF _Toc243757976 \h </w:instrText>
+              <w:instrText xml:space="preserve"> PAGEREF _Toc243766310 \h </w:instrText>
             </w:r>
             <w:r>
               <w:rPr>
@@ -610,7 +629,7 @@
                 <w:noProof/>
                 <w:webHidden/>
               </w:rPr>
-              <w:t>8</w:t>
+              <w:t>9</w:t>
             </w:r>
             <w:r>
               <w:rPr>
@@ -628,10 +647,13 @@
               <w:tab w:val="right" w:leader="dot" w:pos="9350"/>
             </w:tabs>
             <w:rPr>
+              <w:rFonts w:asciiTheme="minorHAnsi" w:eastAsiaTheme="minorEastAsia" w:hAnsiTheme="minorHAnsi" w:cstheme="minorBidi"/>
               <w:noProof/>
+              <w:kern w:val="2"/>
+              <w14:ligatures w14:val="standardContextual"/>
             </w:rPr>
           </w:pPr>
-          <w:hyperlink w:anchor="_Toc243757977" w:history="1">
+          <w:hyperlink w:anchor="_Toc243766311" w:history="1">
             <w:r>
               <w:rPr>
                 <w:rStyle w:val="Hipervnculo"/>
@@ -658,7 +680,7 @@
                 <w:noProof/>
                 <w:webHidden/>
               </w:rPr>
-              <w:instrText xml:space="preserve"> PAGEREF _Toc243757977 \h </w:instrText>
+              <w:instrText xml:space="preserve"> PAGEREF _Toc243766311 \h </w:instrText>
             </w:r>
             <w:r>
               <w:rPr>
@@ -678,7 +700,7 @@
                 <w:noProof/>
                 <w:webHidden/>
               </w:rPr>
-              <w:t>8</w:t>
+              <w:t>9</w:t>
             </w:r>
             <w:r>
               <w:rPr>
@@ -696,10 +718,13 @@
               <w:tab w:val="right" w:leader="dot" w:pos="9350"/>
             </w:tabs>
             <w:rPr>
+              <w:rFonts w:asciiTheme="minorHAnsi" w:eastAsiaTheme="minorEastAsia" w:hAnsiTheme="minorHAnsi" w:cstheme="minorBidi"/>
               <w:noProof/>
+              <w:kern w:val="2"/>
+              <w14:ligatures w14:val="standardContextual"/>
             </w:rPr>
           </w:pPr>
-          <w:hyperlink w:anchor="_Toc243757978" w:history="1">
+          <w:hyperlink w:anchor="_Toc243766312" w:history="1">
             <w:r>
               <w:rPr>
                 <w:rStyle w:val="Hipervnculo"/>
@@ -726,7 +751,7 @@
                 <w:noProof/>
                 <w:webHidden/>
               </w:rPr>
-              <w:instrText xml:space="preserve"> PAGEREF _Toc243757978 \h </w:instrText>
+              <w:instrText xml:space="preserve"> PAGEREF _Toc243766312 \h </w:instrText>
             </w:r>
             <w:r>
               <w:rPr>
@@ -746,7 +771,7 @@
                 <w:noProof/>
                 <w:webHidden/>
               </w:rPr>
-              <w:t>8</w:t>
+              <w:t>10</w:t>
             </w:r>
             <w:r>
               <w:rPr>
@@ -764,10 +789,13 @@
               <w:tab w:val="right" w:leader="dot" w:pos="9350"/>
             </w:tabs>
             <w:rPr>
+              <w:rFonts w:asciiTheme="minorHAnsi" w:eastAsiaTheme="minorEastAsia" w:hAnsiTheme="minorHAnsi" w:cstheme="minorBidi"/>
               <w:noProof/>
+              <w:kern w:val="2"/>
+              <w14:ligatures w14:val="standardContextual"/>
             </w:rPr>
           </w:pPr>
-          <w:hyperlink w:anchor="_Toc243757979" w:history="1">
+          <w:hyperlink w:anchor="_Toc243766313" w:history="1">
             <w:r>
               <w:rPr>
                 <w:rStyle w:val="Hipervnculo"/>
@@ -794,7 +822,7 @@
                 <w:noProof/>
                 <w:webHidden/>
               </w:rPr>
-              <w:instrText xml:space="preserve"> PAGEREF _Toc243757979 \h </w:instrText>
+              <w:instrText xml:space="preserve"> PAGEREF _Toc243766313 \h </w:instrText>
             </w:r>
             <w:r>
               <w:rPr>
@@ -814,7 +842,7 @@
                 <w:noProof/>
                 <w:webHidden/>
               </w:rPr>
-              <w:t>8</w:t>
+              <w:t>10</w:t>
             </w:r>
             <w:r>
               <w:rPr>
@@ -832,10 +860,13 @@
               <w:tab w:val="right" w:leader="dot" w:pos="9350"/>
             </w:tabs>
             <w:rPr>
+              <w:rFonts w:asciiTheme="minorHAnsi" w:eastAsiaTheme="minorEastAsia" w:hAnsiTheme="minorHAnsi" w:cstheme="minorBidi"/>
               <w:noProof/>
+              <w:kern w:val="2"/>
+              <w14:ligatures w14:val="standardContextual"/>
             </w:rPr>
           </w:pPr>
-          <w:hyperlink w:anchor="_Toc243757980" w:history="1">
+          <w:hyperlink w:anchor="_Toc243766314" w:history="1">
             <w:r>
               <w:rPr>
                 <w:rStyle w:val="Hipervnculo"/>
@@ -862,7 +893,7 @@
                 <w:noProof/>
                 <w:webHidden/>
               </w:rPr>
-              <w:instrText xml:space="preserve"> PAGEREF _Toc243757980 \h </w:instrText>
+              <w:instrText xml:space="preserve"> PAGEREF _Toc243766314 \h </w:instrText>
             </w:r>
             <w:r>
               <w:rPr>
@@ -882,7 +913,7 @@
                 <w:noProof/>
                 <w:webHidden/>
               </w:rPr>
-              <w:t>9</w:t>
+              <w:t>10</w:t>
             </w:r>
             <w:r>
               <w:rPr>
@@ -900,10 +931,13 @@
               <w:tab w:val="right" w:leader="dot" w:pos="9350"/>
             </w:tabs>
             <w:rPr>
+              <w:rFonts w:asciiTheme="minorHAnsi" w:eastAsiaTheme="minorEastAsia" w:hAnsiTheme="minorHAnsi" w:cstheme="minorBidi"/>
               <w:noProof/>
+              <w:kern w:val="2"/>
+              <w14:ligatures w14:val="standardContextual"/>
             </w:rPr>
           </w:pPr>
-          <w:hyperlink w:anchor="_Toc243757981" w:history="1">
+          <w:hyperlink w:anchor="_Toc243766315" w:history="1">
             <w:r>
               <w:rPr>
                 <w:rStyle w:val="Hipervnculo"/>
@@ -930,7 +964,7 @@
                 <w:noProof/>
                 <w:webHidden/>
               </w:rPr>
-              <w:instrText xml:space="preserve"> PAGEREF _Toc243757981 \h </w:instrText>
+              <w:instrText xml:space="preserve"> PAGEREF _Toc243766315 \h </w:instrText>
             </w:r>
             <w:r>
               <w:rPr>
@@ -950,7 +984,7 @@
                 <w:noProof/>
                 <w:webHidden/>
               </w:rPr>
-              <w:t>9</w:t>
+              <w:t>11</w:t>
             </w:r>
             <w:r>
               <w:rPr>
@@ -968,10 +1002,13 @@
               <w:tab w:val="right" w:leader="dot" w:pos="9350"/>
             </w:tabs>
             <w:rPr>
+              <w:rFonts w:asciiTheme="minorHAnsi" w:eastAsiaTheme="minorEastAsia" w:hAnsiTheme="minorHAnsi" w:cstheme="minorBidi"/>
               <w:noProof/>
+              <w:kern w:val="2"/>
+              <w14:ligatures w14:val="standardContextual"/>
             </w:rPr>
           </w:pPr>
-          <w:hyperlink w:anchor="_Toc243757982" w:history="1">
+          <w:hyperlink w:anchor="_Toc243766316" w:history="1">
             <w:r>
               <w:rPr>
                 <w:rStyle w:val="Hipervnculo"/>
@@ -998,7 +1035,7 @@
                 <w:noProof/>
                 <w:webHidden/>
               </w:rPr>
-              <w:instrText xml:space="preserve"> PAGEREF _Toc243757982 \h </w:instrText>
+              <w:instrText xml:space="preserve"> PAGEREF _Toc243766316 \h </w:instrText>
             </w:r>
             <w:r>
               <w:rPr>
@@ -1018,7 +1055,7 @@
                 <w:noProof/>
                 <w:webHidden/>
               </w:rPr>
-              <w:t>10</w:t>
+              <w:t>12</w:t>
             </w:r>
             <w:r>
               <w:rPr>
@@ -1036,10 +1073,13 @@
               <w:tab w:val="right" w:leader="dot" w:pos="9350"/>
             </w:tabs>
             <w:rPr>
+              <w:rFonts w:asciiTheme="minorHAnsi" w:eastAsiaTheme="minorEastAsia" w:hAnsiTheme="minorHAnsi" w:cstheme="minorBidi"/>
               <w:noProof/>
+              <w:kern w:val="2"/>
+              <w14:ligatures w14:val="standardContextual"/>
             </w:rPr>
           </w:pPr>
-          <w:hyperlink w:anchor="_Toc243757983" w:history="1">
+          <w:hyperlink w:anchor="_Toc243766317" w:history="1">
             <w:r>
               <w:rPr>
                 <w:rStyle w:val="Hipervnculo"/>
@@ -1066,7 +1106,7 @@
                 <w:noProof/>
                 <w:webHidden/>
               </w:rPr>
-              <w:instrText xml:space="preserve"> PAGEREF _Toc243757983 \h </w:instrText>
+              <w:instrText xml:space="preserve"> PAGEREF _Toc243766317 \h </w:instrText>
             </w:r>
             <w:r>
               <w:rPr>
@@ -1086,7 +1126,7 @@
                 <w:noProof/>
                 <w:webHidden/>
               </w:rPr>
-              <w:t>10</w:t>
+              <w:t>12</w:t>
             </w:r>
             <w:r>
               <w:rPr>
@@ -1104,10 +1144,13 @@
               <w:tab w:val="right" w:leader="dot" w:pos="9350"/>
             </w:tabs>
             <w:rPr>
+              <w:rFonts w:asciiTheme="minorHAnsi" w:eastAsiaTheme="minorEastAsia" w:hAnsiTheme="minorHAnsi" w:cstheme="minorBidi"/>
               <w:noProof/>
+              <w:kern w:val="2"/>
+              <w14:ligatures w14:val="standardContextual"/>
             </w:rPr>
           </w:pPr>
-          <w:hyperlink w:anchor="_Toc243757984" w:history="1">
+          <w:hyperlink w:anchor="_Toc243766318" w:history="1">
             <w:r>
               <w:rPr>
                 <w:rStyle w:val="Hipervnculo"/>
@@ -1134,7 +1177,7 @@
                 <w:noProof/>
                 <w:webHidden/>
               </w:rPr>
-              <w:instrText xml:space="preserve"> PAGEREF _Toc243757984 \h </w:instrText>
+              <w:instrText xml:space="preserve"> PAGEREF _Toc243766318 \h </w:instrText>
             </w:r>
             <w:r>
               <w:rPr>
@@ -1154,7 +1197,7 @@
                 <w:noProof/>
                 <w:webHidden/>
               </w:rPr>
-              <w:t>11</w:t>
+              <w:t>13</w:t>
             </w:r>
             <w:r>
               <w:rPr>
@@ -1172,10 +1215,13 @@
               <w:tab w:val="right" w:leader="dot" w:pos="9350"/>
             </w:tabs>
             <w:rPr>
+              <w:rFonts w:asciiTheme="minorHAnsi" w:eastAsiaTheme="minorEastAsia" w:hAnsiTheme="minorHAnsi" w:cstheme="minorBidi"/>
               <w:noProof/>
+              <w:kern w:val="2"/>
+              <w14:ligatures w14:val="standardContextual"/>
             </w:rPr>
           </w:pPr>
-          <w:hyperlink w:anchor="_Toc243757985" w:history="1">
+          <w:hyperlink w:anchor="_Toc243766319" w:history="1">
             <w:r>
               <w:rPr>
                 <w:rStyle w:val="Hipervnculo"/>
@@ -1202,7 +1248,7 @@
                 <w:noProof/>
                 <w:webHidden/>
               </w:rPr>
-              <w:instrText xml:space="preserve"> PAGEREF _Toc243757985 \h </w:instrText>
+              <w:instrText xml:space="preserve"> PAGEREF _Toc243766319 \h </w:instrText>
             </w:r>
             <w:r>
               <w:rPr>
@@ -1222,7 +1268,7 @@
                 <w:noProof/>
                 <w:webHidden/>
               </w:rPr>
-              <w:t>11</w:t>
+              <w:t>13</w:t>
             </w:r>
             <w:r>
               <w:rPr>
@@ -1240,10 +1286,13 @@
               <w:tab w:val="right" w:leader="dot" w:pos="9350"/>
             </w:tabs>
             <w:rPr>
+              <w:rFonts w:asciiTheme="minorHAnsi" w:eastAsiaTheme="minorEastAsia" w:hAnsiTheme="minorHAnsi" w:cstheme="minorBidi"/>
               <w:noProof/>
+              <w:kern w:val="2"/>
+              <w14:ligatures w14:val="standardContextual"/>
             </w:rPr>
           </w:pPr>
-          <w:hyperlink w:anchor="_Toc243757986" w:history="1">
+          <w:hyperlink w:anchor="_Toc243766320" w:history="1">
             <w:r>
               <w:rPr>
                 <w:rStyle w:val="Hipervnculo"/>
@@ -1270,7 +1319,7 @@
                 <w:noProof/>
                 <w:webHidden/>
               </w:rPr>
-              <w:instrText xml:space="preserve"> PAGEREF _Toc243757986 \h </w:instrText>
+              <w:instrText xml:space="preserve"> PAGEREF _Toc243766320 \h </w:instrText>
             </w:r>
             <w:r>
               <w:rPr>
@@ -1290,7 +1339,7 @@
                 <w:noProof/>
                 <w:webHidden/>
               </w:rPr>
-              <w:t>12</w:t>
+              <w:t>14</w:t>
             </w:r>
             <w:r>
               <w:rPr>
@@ -1308,10 +1357,13 @@
               <w:tab w:val="right" w:leader="dot" w:pos="9350"/>
             </w:tabs>
             <w:rPr>
+              <w:rFonts w:asciiTheme="minorHAnsi" w:eastAsiaTheme="minorEastAsia" w:hAnsiTheme="minorHAnsi" w:cstheme="minorBidi"/>
               <w:noProof/>
+              <w:kern w:val="2"/>
+              <w14:ligatures w14:val="standardContextual"/>
             </w:rPr>
           </w:pPr>
-          <w:hyperlink w:anchor="_Toc243757987" w:history="1">
+          <w:hyperlink w:anchor="_Toc243766321" w:history="1">
             <w:r>
               <w:rPr>
                 <w:rStyle w:val="Hipervnculo"/>
@@ -1338,7 +1390,7 @@
                 <w:noProof/>
                 <w:webHidden/>
               </w:rPr>
-              <w:instrText xml:space="preserve"> PAGEREF _Toc243757987 \h </w:instrText>
+              <w:instrText xml:space="preserve"> PAGEREF _Toc243766321 \h </w:instrText>
             </w:r>
             <w:r>
               <w:rPr>
@@ -1358,7 +1410,7 @@
                 <w:noProof/>
                 <w:webHidden/>
               </w:rPr>
-              <w:t>13</w:t>
+              <w:t>15</w:t>
             </w:r>
             <w:r>
               <w:rPr>
@@ -1376,10 +1428,13 @@
               <w:tab w:val="right" w:leader="dot" w:pos="9350"/>
             </w:tabs>
             <w:rPr>
+              <w:rFonts w:asciiTheme="minorHAnsi" w:eastAsiaTheme="minorEastAsia" w:hAnsiTheme="minorHAnsi" w:cstheme="minorBidi"/>
               <w:noProof/>
+              <w:kern w:val="2"/>
+              <w14:ligatures w14:val="standardContextual"/>
             </w:rPr>
           </w:pPr>
-          <w:hyperlink w:anchor="_Toc243757988" w:history="1">
+          <w:hyperlink w:anchor="_Toc243766322" w:history="1">
             <w:r>
               <w:rPr>
                 <w:rStyle w:val="Hipervnculo"/>
@@ -1406,7 +1461,7 @@
                 <w:noProof/>
                 <w:webHidden/>
               </w:rPr>
-              <w:instrText xml:space="preserve"> PAGEREF _Toc243757988 \h </w:instrText>
+              <w:instrText xml:space="preserve"> PAGEREF _Toc243766322 \h </w:instrText>
             </w:r>
             <w:r>
               <w:rPr>
@@ -1426,7 +1481,7 @@
                 <w:noProof/>
                 <w:webHidden/>
               </w:rPr>
-              <w:t>14</w:t>
+              <w:t>16</w:t>
             </w:r>
             <w:r>
               <w:rPr>
@@ -1444,10 +1499,13 @@
               <w:tab w:val="right" w:leader="dot" w:pos="9350"/>
             </w:tabs>
             <w:rPr>
+              <w:rFonts w:asciiTheme="minorHAnsi" w:eastAsiaTheme="minorEastAsia" w:hAnsiTheme="minorHAnsi" w:cstheme="minorBidi"/>
               <w:noProof/>
+              <w:kern w:val="2"/>
+              <w14:ligatures w14:val="standardContextual"/>
             </w:rPr>
           </w:pPr>
-          <w:hyperlink w:anchor="_Toc243757989" w:history="1">
+          <w:hyperlink w:anchor="_Toc243766323" w:history="1">
             <w:r>
               <w:rPr>
                 <w:rStyle w:val="Hipervnculo"/>
@@ -1474,7 +1532,7 @@
                 <w:noProof/>
                 <w:webHidden/>
               </w:rPr>
-              <w:instrText xml:space="preserve"> PAGEREF _Toc243757989 \h </w:instrText>
+              <w:instrText xml:space="preserve"> PAGEREF _Toc243766323 \h </w:instrText>
             </w:r>
             <w:r>
               <w:rPr>
@@ -1494,7 +1552,7 @@
                 <w:noProof/>
                 <w:webHidden/>
               </w:rPr>
-              <w:t>16</w:t>
+              <w:t>18</w:t>
             </w:r>
             <w:r>
               <w:rPr>
@@ -1553,6 +1611,7 @@
           <w:docPartUnique/>
         </w:docPartObj>
       </w:sdtPr>
+      <w:sdtEndPr/>
       <w:sdtContent>
         <w:p>
           <w:pPr>
@@ -1561,7 +1620,7 @@
               <w:tab w:val="right" w:leader="dot" w:pos="9350"/>
             </w:tabs>
             <w:rPr>
-              <w:rFonts w:eastAsiaTheme="minorEastAsia"/>
+              <w:rFonts w:asciiTheme="minorHAnsi" w:eastAsiaTheme="minorEastAsia" w:hAnsiTheme="minorHAnsi" w:cstheme="minorBidi"/>
               <w:noProof/>
               <w:kern w:val="2"/>
               <w14:ligatures w14:val="standardContextual"/>
@@ -1576,7 +1635,7 @@
           <w:r>
             <w:fldChar w:fldCharType="separate"/>
           </w:r>
-          <w:hyperlink w:anchor="_Toc243757990" w:history="1">
+          <w:hyperlink w:anchor="_Toc243766358" w:history="1">
             <w:r>
               <w:rPr>
                 <w:rStyle w:val="Hipervnculo"/>
@@ -1614,7 +1673,7 @@
                 <w:noProof/>
                 <w:webHidden/>
               </w:rPr>
-              <w:instrText xml:space="preserve"> PAGEREF _Toc243757990 \h </w:instrText>
+              <w:instrText xml:space="preserve"> PAGEREF _Toc243766358 \h </w:instrText>
             </w:r>
             <w:r>
               <w:rPr>
@@ -1634,7 +1693,7 @@
                 <w:noProof/>
                 <w:webHidden/>
               </w:rPr>
-              <w:t>6</w:t>
+              <w:t>7</w:t>
             </w:r>
             <w:r>
               <w:rPr>
@@ -1652,13 +1711,13 @@
               <w:tab w:val="right" w:leader="dot" w:pos="9350"/>
             </w:tabs>
             <w:rPr>
-              <w:rFonts w:eastAsiaTheme="minorEastAsia"/>
+              <w:rFonts w:asciiTheme="minorHAnsi" w:eastAsiaTheme="minorEastAsia" w:hAnsiTheme="minorHAnsi" w:cstheme="minorBidi"/>
               <w:noProof/>
               <w:kern w:val="2"/>
               <w14:ligatures w14:val="standardContextual"/>
             </w:rPr>
           </w:pPr>
-          <w:hyperlink w:anchor="_Toc243757991" w:history="1">
+          <w:hyperlink w:anchor="_Toc243766359" w:history="1">
             <w:r>
               <w:rPr>
                 <w:rStyle w:val="Hipervnculo"/>
@@ -1696,7 +1755,7 @@
                 <w:noProof/>
                 <w:webHidden/>
               </w:rPr>
-              <w:instrText xml:space="preserve"> PAGEREF _Toc243757991 \h </w:instrText>
+              <w:instrText xml:space="preserve"> PAGEREF _Toc243766359 \h </w:instrText>
             </w:r>
             <w:r>
               <w:rPr>
@@ -1716,7 +1775,7 @@
                 <w:noProof/>
                 <w:webHidden/>
               </w:rPr>
-              <w:t>10</w:t>
+              <w:t>12</w:t>
             </w:r>
             <w:r>
               <w:rPr>
@@ -1734,13 +1793,13 @@
               <w:tab w:val="right" w:leader="dot" w:pos="9350"/>
             </w:tabs>
             <w:rPr>
-              <w:rFonts w:eastAsiaTheme="minorEastAsia"/>
+              <w:rFonts w:asciiTheme="minorHAnsi" w:eastAsiaTheme="minorEastAsia" w:hAnsiTheme="minorHAnsi" w:cstheme="minorBidi"/>
               <w:noProof/>
               <w:kern w:val="2"/>
               <w14:ligatures w14:val="standardContextual"/>
             </w:rPr>
           </w:pPr>
-          <w:hyperlink w:anchor="_Toc243757992" w:history="1">
+          <w:hyperlink w:anchor="_Toc243766360" w:history="1">
             <w:r>
               <w:rPr>
                 <w:rStyle w:val="Hipervnculo"/>
@@ -1748,7 +1807,7 @@
                 <w:bCs/>
                 <w:noProof/>
               </w:rPr>
-              <w:t>Tabla 3</w:t>
+              <w:t xml:space="preserve">Tabla 3  </w:t>
             </w:r>
             <w:r>
               <w:rPr>
@@ -1757,7 +1816,7 @@
                 <w:iCs/>
                 <w:noProof/>
               </w:rPr>
-              <w:t xml:space="preserve"> Diccionario inicial de variables</w:t>
+              <w:t>Diccionario inicial de variables</w:t>
             </w:r>
             <w:r>
               <w:rPr>
@@ -1778,7 +1837,7 @@
                 <w:noProof/>
                 <w:webHidden/>
               </w:rPr>
-              <w:instrText xml:space="preserve"> PAGEREF _Toc243757992 \h </w:instrText>
+              <w:instrText xml:space="preserve"> PAGEREF _Toc243766360 \h </w:instrText>
             </w:r>
             <w:r>
               <w:rPr>
@@ -1798,7 +1857,7 @@
                 <w:noProof/>
                 <w:webHidden/>
               </w:rPr>
-              <w:t>11</w:t>
+              <w:t>13</w:t>
             </w:r>
             <w:r>
               <w:rPr>
@@ -1816,13 +1875,13 @@
               <w:tab w:val="right" w:leader="dot" w:pos="9350"/>
             </w:tabs>
             <w:rPr>
-              <w:rFonts w:eastAsiaTheme="minorEastAsia"/>
+              <w:rFonts w:asciiTheme="minorHAnsi" w:eastAsiaTheme="minorEastAsia" w:hAnsiTheme="minorHAnsi" w:cstheme="minorBidi"/>
               <w:noProof/>
               <w:kern w:val="2"/>
               <w14:ligatures w14:val="standardContextual"/>
             </w:rPr>
           </w:pPr>
-          <w:hyperlink w:anchor="_Toc243757993" w:history="1">
+          <w:hyperlink w:anchor="_Toc243766361" w:history="1">
             <w:r>
               <w:rPr>
                 <w:rStyle w:val="Hipervnculo"/>
@@ -1860,7 +1919,7 @@
                 <w:noProof/>
                 <w:webHidden/>
               </w:rPr>
-              <w:instrText xml:space="preserve"> PAGEREF _Toc243757993 \h </w:instrText>
+              <w:instrText xml:space="preserve"> PAGEREF _Toc243766361 \h </w:instrText>
             </w:r>
             <w:r>
               <w:rPr>
@@ -1880,7 +1939,7 @@
                 <w:noProof/>
                 <w:webHidden/>
               </w:rPr>
-              <w:t>13</w:t>
+              <w:t>15</w:t>
             </w:r>
             <w:r>
               <w:rPr>
@@ -1898,13 +1957,13 @@
               <w:tab w:val="right" w:leader="dot" w:pos="9350"/>
             </w:tabs>
             <w:rPr>
-              <w:rFonts w:eastAsiaTheme="minorEastAsia"/>
+              <w:rFonts w:asciiTheme="minorHAnsi" w:eastAsiaTheme="minorEastAsia" w:hAnsiTheme="minorHAnsi" w:cstheme="minorBidi"/>
               <w:noProof/>
               <w:kern w:val="2"/>
               <w14:ligatures w14:val="standardContextual"/>
             </w:rPr>
           </w:pPr>
-          <w:hyperlink w:anchor="_Toc243757994" w:history="1">
+          <w:hyperlink w:anchor="_Toc243766362" w:history="1">
             <w:r>
               <w:rPr>
                 <w:rStyle w:val="Hipervnculo"/>
@@ -1942,7 +2001,7 @@
                 <w:noProof/>
                 <w:webHidden/>
               </w:rPr>
-              <w:instrText xml:space="preserve"> PAGEREF _Toc243757994 \h </w:instrText>
+              <w:instrText xml:space="preserve"> PAGEREF _Toc243766362 \h </w:instrText>
             </w:r>
             <w:r>
               <w:rPr>
@@ -1962,7 +2021,7 @@
                 <w:noProof/>
                 <w:webHidden/>
               </w:rPr>
-              <w:t>14</w:t>
+              <w:t>16</w:t>
             </w:r>
             <w:r>
               <w:rPr>
@@ -2003,7 +2062,7 @@
       <w:pPr>
         <w:pStyle w:val="Ttulo1"/>
       </w:pPr>
-      <w:bookmarkStart w:id="0" w:name="_Toc243757970"/>
+      <w:bookmarkStart w:id="0" w:name="_Toc243766304"/>
       <w:r>
         <w:lastRenderedPageBreak/>
         <w:t>Introducción</w:t>
@@ -2078,7 +2137,7 @@
       <w:pPr>
         <w:pStyle w:val="Ttulo2"/>
       </w:pPr>
-      <w:bookmarkStart w:id="1" w:name="_Toc243757971"/>
+      <w:bookmarkStart w:id="1" w:name="_Toc243766305"/>
       <w:r>
         <w:t>Necesidad</w:t>
       </w:r>
@@ -2111,7 +2170,7 @@
       <w:pPr>
         <w:pStyle w:val="Ttulo2"/>
       </w:pPr>
-      <w:bookmarkStart w:id="2" w:name="_Toc243757972"/>
+      <w:bookmarkStart w:id="2" w:name="_Toc243766306"/>
       <w:r>
         <w:lastRenderedPageBreak/>
         <w:t>Alcance</w:t>
@@ -2175,11 +2234,17 @@
       </w:r>
     </w:p>
     <w:p>
+      <w:r>
+        <w:br w:type="page"/>
+      </w:r>
+    </w:p>
+    <w:p>
       <w:pPr>
         <w:pStyle w:val="Ttulo1"/>
       </w:pPr>
-      <w:bookmarkStart w:id="3" w:name="_Toc243757973"/>
-      <w:r>
+      <w:bookmarkStart w:id="3" w:name="_Toc243766307"/>
+      <w:r>
+        <w:lastRenderedPageBreak/>
         <w:t>Planteamiento de la necesidad</w:t>
       </w:r>
       <w:bookmarkEnd w:id="3"/>
@@ -2188,7 +2253,7 @@
       <w:pPr>
         <w:pStyle w:val="Ttulo4"/>
       </w:pPr>
-      <w:bookmarkStart w:id="4" w:name="_Toc243757990"/>
+      <w:bookmarkStart w:id="4" w:name="_Toc243766358"/>
       <w:r>
         <w:rPr>
           <w:b/>
@@ -2697,7 +2762,6 @@
                 <w:sz w:val="20"/>
                 <w:szCs w:val="20"/>
               </w:rPr>
-              <w:lastRenderedPageBreak/>
               <w:t>Tipo de análisis</w:t>
             </w:r>
           </w:p>
@@ -2736,6 +2800,10 @@
     <w:p>
       <w:pPr>
         <w:spacing w:after="240" w:line="240" w:lineRule="auto"/>
+        <w:rPr>
+          <w:sz w:val="20"/>
+          <w:szCs w:val="20"/>
+        </w:rPr>
       </w:pPr>
       <w:r>
         <w:rPr>
@@ -2756,10 +2824,26 @@
     </w:p>
     <w:p>
       <w:pPr>
+        <w:rPr>
+          <w:sz w:val="20"/>
+          <w:szCs w:val="20"/>
+        </w:rPr>
+      </w:pPr>
+      <w:r>
+        <w:rPr>
+          <w:sz w:val="20"/>
+          <w:szCs w:val="20"/>
+        </w:rPr>
+        <w:br w:type="page"/>
+      </w:r>
+    </w:p>
+    <w:p>
+      <w:pPr>
         <w:pStyle w:val="Ttulo1"/>
       </w:pPr>
-      <w:bookmarkStart w:id="5" w:name="_Toc243757974"/>
-      <w:r>
+      <w:bookmarkStart w:id="5" w:name="_Toc243766308"/>
+      <w:r>
+        <w:lastRenderedPageBreak/>
         <w:t>Justificación</w:t>
       </w:r>
       <w:bookmarkEnd w:id="5"/>
@@ -2884,7 +2968,7 @@
       <w:pPr>
         <w:pStyle w:val="Ttulo1"/>
       </w:pPr>
-      <w:bookmarkStart w:id="6" w:name="_Toc243757975"/>
+      <w:bookmarkStart w:id="6" w:name="_Toc243766309"/>
       <w:r>
         <w:lastRenderedPageBreak/>
         <w:t>Objetivos</w:t>
@@ -2895,7 +2979,7 @@
       <w:pPr>
         <w:pStyle w:val="Ttulo2"/>
       </w:pPr>
-      <w:bookmarkStart w:id="7" w:name="_Toc243757976"/>
+      <w:bookmarkStart w:id="7" w:name="_Toc243766310"/>
       <w:r>
         <w:t>Objetivo general</w:t>
       </w:r>
@@ -2937,7 +3021,7 @@
       <w:pPr>
         <w:pStyle w:val="Ttulo2"/>
       </w:pPr>
-      <w:bookmarkStart w:id="8" w:name="_Toc243757977"/>
+      <w:bookmarkStart w:id="8" w:name="_Toc243766311"/>
       <w:r>
         <w:t>Objetivos específicos</w:t>
       </w:r>
@@ -3081,10 +3165,24 @@
     </w:p>
     <w:p>
       <w:pPr>
+        <w:rPr>
+          <w:color w:val="000000"/>
+        </w:rPr>
+      </w:pPr>
+      <w:r>
+        <w:rPr>
+          <w:color w:val="000000"/>
+        </w:rPr>
+        <w:br w:type="page"/>
+      </w:r>
+    </w:p>
+    <w:p>
+      <w:pPr>
         <w:pStyle w:val="Ttulo1"/>
       </w:pPr>
-      <w:bookmarkStart w:id="9" w:name="_Toc243757978"/>
-      <w:r>
+      <w:bookmarkStart w:id="9" w:name="_Toc243766312"/>
+      <w:r>
+        <w:lastRenderedPageBreak/>
         <w:t>Marco teórico y legal</w:t>
       </w:r>
       <w:bookmarkEnd w:id="9"/>
@@ -3093,7 +3191,7 @@
       <w:pPr>
         <w:pStyle w:val="Ttulo2"/>
       </w:pPr>
-      <w:bookmarkStart w:id="10" w:name="_Toc243757979"/>
+      <w:bookmarkStart w:id="10" w:name="_Toc243766313"/>
       <w:r>
         <w:t>Analítica descriptiva y calidad de los datos</w:t>
       </w:r>
@@ -3104,17 +3202,14 @@
         <w:ind w:firstLine="720"/>
       </w:pPr>
       <w:r>
-        <w:t xml:space="preserve">La analítica descriptiva resume y compara lo que muestran los datos mediante medidas de tendencia central, dispersión y posición, sin predecir ni establecer causas. En precios de vivienda, que suelen tener asimetría positiva por un grupo pequeño de inmuebles muy costosos, </w:t>
-      </w:r>
-      <w:r>
-        <w:lastRenderedPageBreak/>
-        <w:t>la mediana</w:t>
+        <w:t>La analítica descriptiva resume y compara lo que muestran los datos mediante medidas de tendencia central, dispersión y posición, sin predecir ni establecer causas. En precios de vivienda, que suelen tener asimetría positiva por un grupo pequeño de inmuebles muy costosos, la mediana</w:t>
       </w:r>
       <w:sdt>
         <w:sdtPr>
           <w:tag w:val="goog_rdk_0"/>
           <w:id w:val="1262436647"/>
         </w:sdtPr>
+        <w:sdtEndPr/>
         <w:sdtContent>
           <w:r>
             <w:rPr>
@@ -3364,6 +3459,7 @@
           <w:id w:val="1606674555"/>
           <w:citation/>
         </w:sdtPr>
+        <w:sdtEndPr/>
         <w:sdtContent>
           <w:r>
             <w:rPr>
@@ -3409,7 +3505,7 @@
       <w:pPr>
         <w:pStyle w:val="Ttulo2"/>
       </w:pPr>
-      <w:bookmarkStart w:id="11" w:name="_Toc243757980"/>
+      <w:bookmarkStart w:id="11" w:name="_Toc243766314"/>
       <w:r>
         <w:t>Origen de los datos, autoría y uso autorizado</w:t>
       </w:r>
@@ -3590,6 +3686,7 @@
           <w:id w:val="758809854"/>
           <w:citation/>
         </w:sdtPr>
+        <w:sdtEndPr/>
         <w:sdtContent>
           <w:r>
             <w:rPr>
@@ -3684,6 +3781,7 @@
           <w:id w:val="1290402404"/>
           <w:citation/>
         </w:sdtPr>
+        <w:sdtEndPr/>
         <w:sdtContent>
           <w:r>
             <w:rPr>
@@ -3771,8 +3869,9 @@
       <w:pPr>
         <w:pStyle w:val="Ttulo2"/>
       </w:pPr>
-      <w:bookmarkStart w:id="12" w:name="_Toc243757981"/>
-      <w:r>
+      <w:bookmarkStart w:id="12" w:name="_Toc243766315"/>
+      <w:r>
+        <w:lastRenderedPageBreak/>
         <w:t>Marco legal</w:t>
       </w:r>
       <w:bookmarkEnd w:id="12"/>
@@ -3941,14 +4040,7 @@
         <w:rPr>
           <w:color w:val="000000"/>
         </w:rPr>
-        <w:t xml:space="preserve">, compilado en el Decreto 1074 de </w:t>
-      </w:r>
-      <w:r>
-        <w:rPr>
-          <w:color w:val="000000"/>
-        </w:rPr>
-        <w:lastRenderedPageBreak/>
-        <w:t>2015</w:t>
+        <w:t>, compilado en el Decreto 1074 de 2015</w:t>
       </w:r>
       <w:r>
         <w:t>, regula el tratamiento de datos personales y establece principios como finalidad, libertad, veracidad, transparencia, seguridad y confidencialidad.</w:t>
@@ -3971,11 +4063,17 @@
       </w:r>
     </w:p>
     <w:p>
+      <w:r>
+        <w:br w:type="page"/>
+      </w:r>
+    </w:p>
+    <w:p>
       <w:pPr>
         <w:pStyle w:val="Ttulo1"/>
       </w:pPr>
-      <w:bookmarkStart w:id="13" w:name="_Toc243757982"/>
-      <w:r>
+      <w:bookmarkStart w:id="13" w:name="_Toc243766316"/>
+      <w:r>
+        <w:lastRenderedPageBreak/>
         <w:t>Metodología de la etapa 1</w:t>
       </w:r>
       <w:bookmarkEnd w:id="13"/>
@@ -3984,7 +4082,7 @@
       <w:pPr>
         <w:pStyle w:val="Ttulo2"/>
       </w:pPr>
-      <w:bookmarkStart w:id="14" w:name="_Toc243757983"/>
+      <w:bookmarkStart w:id="14" w:name="_Toc243766317"/>
       <w:r>
         <w:t xml:space="preserve">Selección y ficha del </w:t>
       </w:r>
@@ -4047,7 +4145,7 @@
       <w:pPr>
         <w:pStyle w:val="Ttulo4"/>
       </w:pPr>
-      <w:bookmarkStart w:id="15" w:name="_Toc243757991"/>
+      <w:bookmarkStart w:id="15" w:name="_Toc243766359"/>
       <w:r>
         <w:rPr>
           <w:b/>
@@ -4718,7 +4816,6 @@
                 <w:sz w:val="20"/>
                 <w:szCs w:val="20"/>
               </w:rPr>
-              <w:lastRenderedPageBreak/>
               <w:t>Fuente original</w:t>
             </w:r>
           </w:p>
@@ -4973,6 +5070,7 @@
                 <w:tag w:val="goog_rdk_1"/>
                 <w:id w:val="1287449768"/>
               </w:sdtPr>
+              <w:sdtEndPr/>
               <w:sdtContent>
                 <w:r>
                   <w:rPr>
@@ -5418,8 +5516,9 @@
       <w:pPr>
         <w:pStyle w:val="Ttulo2"/>
       </w:pPr>
-      <w:bookmarkStart w:id="16" w:name="_Toc243757984"/>
-      <w:r>
+      <w:bookmarkStart w:id="16" w:name="_Toc243766318"/>
+      <w:r>
+        <w:lastRenderedPageBreak/>
         <w:t>Unidad de análisis</w:t>
       </w:r>
       <w:bookmarkEnd w:id="16"/>
@@ -5436,7 +5535,7 @@
       <w:pPr>
         <w:pStyle w:val="Ttulo2"/>
       </w:pPr>
-      <w:bookmarkStart w:id="17" w:name="_Toc243757985"/>
+      <w:bookmarkStart w:id="17" w:name="_Toc243766319"/>
       <w:r>
         <w:t>Diccionario inicial de variables</w:t>
       </w:r>
@@ -5446,7 +5545,7 @@
       <w:pPr>
         <w:pStyle w:val="Ttulo4"/>
       </w:pPr>
-      <w:bookmarkStart w:id="18" w:name="_Toc243757992"/>
+      <w:bookmarkStart w:id="18" w:name="_Toc243766360"/>
       <w:r>
         <w:rPr>
           <w:b/>
@@ -5456,10 +5555,23 @@
       </w:r>
       <w:r>
         <w:rPr>
+          <w:b/>
+          <w:bCs/>
+        </w:rPr>
+        <w:t xml:space="preserve"> </w:t>
+      </w:r>
+      <w:r>
+        <w:rPr>
+          <w:b/>
+          <w:bCs/>
+        </w:rPr>
+        <w:br/>
+      </w:r>
+      <w:r>
+        <w:rPr>
           <w:i/>
           <w:iCs/>
         </w:rPr>
-        <w:br/>
         <w:t>Diccionario inicial de variables</w:t>
       </w:r>
       <w:bookmarkEnd w:id="18"/>
@@ -5517,6 +5629,7 @@
                 <w:tag w:val="goog_rdk_2"/>
                 <w:id w:val="-13731705"/>
               </w:sdtPr>
+              <w:sdtEndPr/>
               <w:sdtContent>
                 <w:r>
                   <w:rPr>
@@ -5687,6 +5800,7 @@
                 <w:tag w:val="goog_rdk_3"/>
                 <w:id w:val="907446770"/>
               </w:sdtPr>
+              <w:sdtEndPr/>
               <w:sdtContent>
                 <w:proofErr w:type="spellStart"/>
                 <w:r>
@@ -5865,6 +5979,7 @@
                 <w:tag w:val="goog_rdk_4"/>
                 <w:id w:val="-1849872927"/>
               </w:sdtPr>
+              <w:sdtEndPr/>
               <w:sdtContent>
                 <w:r>
                   <w:rPr>
@@ -5905,6 +6020,7 @@
                 <w:tag w:val="goog_rdk_5"/>
                 <w:id w:val="1206018362"/>
               </w:sdtPr>
+              <w:sdtEndPr/>
               <w:sdtContent>
                 <w:proofErr w:type="spellStart"/>
                 <w:r>
@@ -6071,6 +6187,7 @@
                 <w:tag w:val="goog_rdk_6"/>
                 <w:id w:val="1234937422"/>
               </w:sdtPr>
+              <w:sdtEndPr/>
               <w:sdtContent>
                 <w:proofErr w:type="spellStart"/>
                 <w:r>
@@ -6237,6 +6354,7 @@
                 <w:tag w:val="goog_rdk_7"/>
                 <w:id w:val="-1435785710"/>
               </w:sdtPr>
+              <w:sdtEndPr/>
               <w:sdtContent>
                 <w:proofErr w:type="spellStart"/>
                 <w:r>
@@ -6413,6 +6531,7 @@
                 <w:tag w:val="goog_rdk_8"/>
                 <w:id w:val="2069382011"/>
               </w:sdtPr>
+              <w:sdtEndPr/>
               <w:sdtContent>
                 <w:proofErr w:type="spellStart"/>
                 <w:r>
@@ -6579,6 +6698,7 @@
                 <w:tag w:val="goog_rdk_9"/>
                 <w:id w:val="1675230666"/>
               </w:sdtPr>
+              <w:sdtEndPr/>
               <w:sdtContent>
                 <w:proofErr w:type="spellStart"/>
                 <w:r>
@@ -6745,6 +6865,7 @@
                 <w:tag w:val="goog_rdk_10"/>
                 <w:id w:val="315434073"/>
               </w:sdtPr>
+              <w:sdtEndPr/>
               <w:sdtContent>
                 <w:r>
                   <w:rPr>
@@ -6901,6 +7022,7 @@
                 <w:tag w:val="goog_rdk_11"/>
                 <w:id w:val="1377375197"/>
               </w:sdtPr>
+              <w:sdtEndPr/>
               <w:sdtContent>
                 <w:proofErr w:type="spellStart"/>
                 <w:r>
@@ -7067,6 +7189,7 @@
                 <w:tag w:val="goog_rdk_12"/>
                 <w:id w:val="1584850235"/>
               </w:sdtPr>
+              <w:sdtEndPr/>
               <w:sdtContent>
                 <w:proofErr w:type="spellStart"/>
                 <w:r>
@@ -7233,6 +7356,7 @@
                 <w:tag w:val="goog_rdk_13"/>
                 <w:id w:val="4405518"/>
               </w:sdtPr>
+              <w:sdtEndPr/>
               <w:sdtContent>
                 <w:proofErr w:type="spellStart"/>
                 <w:r>
@@ -7399,6 +7523,7 @@
                 <w:tag w:val="goog_rdk_14"/>
                 <w:id w:val="2045158393"/>
               </w:sdtPr>
+              <w:sdtEndPr/>
               <w:sdtContent>
                 <w:proofErr w:type="spellStart"/>
                 <w:r>
@@ -7581,6 +7706,7 @@
                 <w:tag w:val="goog_rdk_15"/>
                 <w:id w:val="120480249"/>
               </w:sdtPr>
+              <w:sdtEndPr/>
               <w:sdtContent>
                 <w:proofErr w:type="spellStart"/>
                 <w:r>
@@ -7747,6 +7873,7 @@
                 <w:tag w:val="goog_rdk_16"/>
                 <w:id w:val="418432943"/>
               </w:sdtPr>
+              <w:sdtEndPr/>
               <w:sdtContent>
                 <w:proofErr w:type="spellStart"/>
                 <w:r>
@@ -7882,6 +8009,7 @@
                 <w:tag w:val="goog_rdk_17"/>
                 <w:id w:val="853283088"/>
               </w:sdtPr>
+              <w:sdtEndPr/>
               <w:sdtContent>
                 <w:r>
                   <w:rPr>
@@ -7889,7 +8017,15 @@
                     <w:sz w:val="20"/>
                     <w:szCs w:val="20"/>
                   </w:rPr>
-                  <w:t>−122,52 – −121,32</w:t>
+                  <w:t>−</w:t>
+                </w:r>
+                <w:r>
+                  <w:rPr>
+                    <w:rFonts w:eastAsia="Gungsuh"/>
+                    <w:sz w:val="20"/>
+                    <w:szCs w:val="20"/>
+                  </w:rPr>
+                  <w:t>122,52 – −121,32</w:t>
                 </w:r>
               </w:sdtContent>
             </w:sdt>
@@ -7922,6 +8058,7 @@
                 <w:tag w:val="goog_rdk_18"/>
                 <w:id w:val="1767717486"/>
               </w:sdtPr>
+              <w:sdtEndPr/>
               <w:sdtContent>
                 <w:r>
                   <w:rPr>
@@ -8078,6 +8215,7 @@
                 <w:tag w:val="goog_rdk_19"/>
                 <w:id w:val="696388861"/>
               </w:sdtPr>
+              <w:sdtEndPr/>
               <w:sdtContent>
                 <w:r>
                   <w:rPr>
@@ -8234,6 +8372,7 @@
                 <w:tag w:val="goog_rdk_20"/>
                 <w:id w:val="200608142"/>
               </w:sdtPr>
+              <w:sdtEndPr/>
               <w:sdtContent>
                 <w:proofErr w:type="spellStart"/>
                 <w:r>
@@ -8400,6 +8539,7 @@
                 <w:tag w:val="goog_rdk_21"/>
                 <w:id w:val="99281379"/>
               </w:sdtPr>
+              <w:sdtEndPr/>
               <w:sdtContent>
                 <w:proofErr w:type="spellStart"/>
                 <w:r>
@@ -8566,6 +8706,7 @@
                 <w:tag w:val="goog_rdk_22"/>
                 <w:id w:val="-1022057665"/>
               </w:sdtPr>
+              <w:sdtEndPr/>
               <w:sdtContent>
                 <w:proofErr w:type="spellStart"/>
                 <w:r>
@@ -8748,7 +8889,7 @@
       <w:pPr>
         <w:pStyle w:val="Ttulo2"/>
       </w:pPr>
-      <w:bookmarkStart w:id="19" w:name="_Toc243757986"/>
+      <w:bookmarkStart w:id="19" w:name="_Toc243766320"/>
       <w:r>
         <w:t>Alcance y limitaciones</w:t>
       </w:r>
@@ -8812,7 +8953,6 @@
           <w:bCs/>
           <w:color w:val="000000"/>
         </w:rPr>
-        <w:lastRenderedPageBreak/>
         <w:t>Periodo y cobertura:</w:t>
       </w:r>
       <w:r>
@@ -8945,8 +9085,9 @@
       <w:pPr>
         <w:pStyle w:val="Ttulo2"/>
       </w:pPr>
-      <w:bookmarkStart w:id="20" w:name="_Toc243757987"/>
-      <w:r>
+      <w:bookmarkStart w:id="20" w:name="_Toc243766321"/>
+      <w:r>
+        <w:lastRenderedPageBreak/>
         <w:t>Diseño inicial del análisis</w:t>
       </w:r>
       <w:bookmarkEnd w:id="20"/>
@@ -8955,7 +9096,7 @@
       <w:pPr>
         <w:pStyle w:val="Ttulo4"/>
       </w:pPr>
-      <w:bookmarkStart w:id="21" w:name="_Toc243757993"/>
+      <w:bookmarkStart w:id="21" w:name="_Toc243766361"/>
       <w:r>
         <w:rPr>
           <w:b/>
@@ -9780,6 +9921,7 @@
           <w:tag w:val="goog_rdk_23"/>
           <w:id w:val="-884292506"/>
         </w:sdtPr>
+        <w:sdtEndPr/>
         <w:sdtContent>
           <w:r>
             <w:rPr>
@@ -9805,7 +9947,6 @@
             <w:rPr>
               <w:rFonts w:eastAsia="Gungsuh"/>
             </w:rPr>
-            <w:lastRenderedPageBreak/>
             <w:t>Q1), precio por metro cuadrado = precio / (área habitable / 10,764), antigüedad = 2015 − año de construcción, década de construcción, y condición de remodelación (Sí si el año de renovación es mayor que 0).</w:t>
           </w:r>
         </w:sdtContent>
@@ -9878,8 +10019,9 @@
       <w:pPr>
         <w:pStyle w:val="Ttulo1"/>
       </w:pPr>
-      <w:bookmarkStart w:id="22" w:name="_Toc243757988"/>
-      <w:r>
+      <w:bookmarkStart w:id="22" w:name="_Toc243766322"/>
+      <w:r>
+        <w:lastRenderedPageBreak/>
         <w:t xml:space="preserve">Reconocimiento del </w:t>
       </w:r>
       <w:proofErr w:type="spellStart"/>
@@ -9925,7 +10067,7 @@
       <w:pPr>
         <w:pStyle w:val="Ttulo4"/>
       </w:pPr>
-      <w:bookmarkStart w:id="23" w:name="_Toc243757994"/>
+      <w:bookmarkStart w:id="23" w:name="_Toc243766362"/>
       <w:r>
         <w:rPr>
           <w:b/>
@@ -10546,6 +10688,7 @@
                 <w:tag w:val="goog_rdk_24"/>
                 <w:id w:val="-743891001"/>
               </w:sdtPr>
+              <w:sdtEndPr/>
               <w:sdtContent>
                 <w:r>
                   <w:rPr>
@@ -10722,6 +10865,7 @@
                 <w:tag w:val="goog_rdk_25"/>
                 <w:id w:val="-308954133"/>
               </w:sdtPr>
+              <w:sdtEndPr/>
               <w:sdtContent>
                 <w:r>
                   <w:rPr>
@@ -11072,7 +11216,6 @@
           <w:sz w:val="20"/>
           <w:szCs w:val="20"/>
         </w:rPr>
-        <w:lastRenderedPageBreak/>
         <w:t xml:space="preserve">Nota. </w:t>
       </w:r>
       <w:r>
@@ -11088,7 +11231,10 @@
         <w:ind w:firstLine="720"/>
       </w:pPr>
       <w:r>
-        <w:t>Cómo responden las variables a la necesidad. El precio es la variable que se quiere describir. El área habitable, el área del lote, las habitaciones y los baños permiten comparar el precio según el tamaño. La calificación de construcción y la vista al agua permiten comparar categorías de vivienda. El año de construcción y el año de renovación permiten comparar periodos: décadas de construcción y viviendas remodeladas frente a no remodeladas. En conjunto, estas variables cubren las dimensiones de la pregunta de análisis.</w:t>
+        <w:t>Cómo responden las variables a la necesidad. El precio es la variable que se quiere describir. El área habitable, el área del lote, las habitaciones y los baños permiten comparar el precio según el tamaño. La calificación de construcción y la vista al agua permiten comparar categorías de vivienda. El año de construcción y el año de renovación permiten comparar periodos: décadas de construcción y viviendas remodeladas frente a no remodeladas. En conjunto, estas variables cubren las dimensiones de la pregunta</w:t>
+      </w:r>
+      <w:r>
+        <w:t xml:space="preserve"> de análisis.</w:t>
       </w:r>
     </w:p>
     <w:p>
@@ -11096,6 +11242,7 @@
         <w:ind w:firstLine="720"/>
       </w:pPr>
       <w:r>
+        <w:lastRenderedPageBreak/>
         <w:t>Como primera observación, el precio en dólares va de unos USD 75.000 a USD 7.700.000, con una mediana cercana a USD 450.000 y una media de unos USD 540.000. Que la media sea mayor que la mediana confirma la asimetría positiva esperada en precios de vivienda y justifica usar la mediana para las comparaciones.</w:t>
       </w:r>
     </w:p>
@@ -11108,7 +11255,7 @@
       <w:pPr>
         <w:pStyle w:val="Ttulo1"/>
       </w:pPr>
-      <w:bookmarkStart w:id="24" w:name="_Toc243757989"/>
+      <w:bookmarkStart w:id="24" w:name="_Toc243766323"/>
       <w:r>
         <w:lastRenderedPageBreak/>
         <w:t>Referencias</w:t>
@@ -11120,6 +11267,7 @@
         <w:id w:val="1337866484"/>
         <w:bibliography/>
       </w:sdtPr>
+      <w:sdtEndPr/>
       <w:sdtContent>
         <w:p>
           <w:pPr>
@@ -13023,6 +13171,12 @@
 </file>
 
 <file path=customXml/item1.xml><?xml version="1.0" encoding="utf-8"?>
+<go:gDocsCustomXmlDataStorage xmlns:go="http://customooxmlschemas.google.com/" xmlns:r="http://schemas.openxmlformats.org/officeDocument/2006/relationships" uri="GoogleDocsCustomDataVersion2">
+  <go:docsCustomData xmlns:go="http://customooxmlschemas.google.com/" roundtripDataSignature="AMtx7mj1Mku16Swad7Q4z46jB/7yFgjbrg==">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</go:docsCustomData>
+</go:gDocsCustomXmlDataStorage>
+</file>
+
+<file path=customXml/item2.xml><?xml version="1.0" encoding="utf-8"?>
 <b:Sources xmlns:b="http://schemas.openxmlformats.org/officeDocument/2006/bibliography" xmlns="http://schemas.openxmlformats.org/officeDocument/2006/bibliography" SelectedStyle="\APASixthEditionOfficeOnline.xsl" StyleName="APA" Version="6">
   <b:Source>
     <b:Tag>Wan96</b:Tag>
@@ -13307,25 +13461,19 @@
 </b:Sources>
 </file>
 
-<file path=customXml/item2.xml><?xml version="1.0" encoding="utf-8"?>
-<go:gDocsCustomXmlDataStorage xmlns:go="http://customooxmlschemas.google.com/" xmlns:r="http://schemas.openxmlformats.org/officeDocument/2006/relationships" uri="GoogleDocsCustomDataVersion2">
-  <go:docsCustomData xmlns:go="http://customooxmlschemas.google.com/" roundtripDataSignature="AMtx7mj1Mku16Swad7Q4z46jB/7yFgjbrg==">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</go:docsCustomData>
-</go:gDocsCustomXmlDataStorage>
-</file>
-
 <file path=customXml/itemProps1.xml><?xml version="1.0" encoding="utf-8"?>
-<ds:datastoreItem xmlns:ds="http://schemas.openxmlformats.org/officeDocument/2006/customXml" ds:itemID="{9172DB8B-99BA-43F1-A171-CFBE1D2C18DD}">
-  <ds:schemaRefs>
-    <ds:schemaRef ds:uri="http://schemas.openxmlformats.org/officeDocument/2006/bibliography"/>
-  </ds:schemaRefs>
-</ds:datastoreItem>
-</file>
-
-<file path=customXml/itemProps2.xml><?xml version="1.0" encoding="utf-8"?>
 <ds:datastoreItem xmlns:ds="http://schemas.openxmlformats.org/officeDocument/2006/customXml" ds:itemID="{11111111-1234-1234-1234-123412341234}">
   <ds:schemaRefs>
     <ds:schemaRef ds:uri="http://customooxmlschemas.google.com/"/>
     <ds:schemaRef ds:uri="http://schemas.openxmlformats.org/officeDocument/2006/relationships"/>
   </ds:schemaRefs>
 </ds:datastoreItem>
+</file>
+
+<file path=customXml/itemProps2.xml><?xml version="1.0" encoding="utf-8"?>
+<ds:datastoreItem xmlns:ds="http://schemas.openxmlformats.org/officeDocument/2006/customXml" ds:itemID="{9172DB8B-99BA-43F1-A171-CFBE1D2C18DD}">
+  <ds:schemaRefs>
+    <ds:schemaRef ds:uri="http://schemas.openxmlformats.org/officeDocument/2006/bibliography"/>
+  </ds:schemaRefs>
+</ds:datastoreItem>
 </file>
</xml_diff>